<commit_message>
Maitê Proença: revisão da parte 3
Co-Authored-By: Claude Opus 5.5 <noreply@anthropic.com>
Claude-Session: https://claude.ai/code/session_01MJjUEEZrxQDEUifKK2vj9g
</commit_message>
<xml_diff>
--- a/roteiros/maite-proenca/MaiteProenca_Parte3.docx
+++ b/roteiros/maite-proenca/MaiteProenca_Parte3.docx
@@ -127,7 +127,7 @@
         <w:rPr>
           <w:color w:val="000000"/>
         </w:rPr>
-        <w:t>Para defender Augusto no júri, a família contratou um dos criminalistas mais famosos do Brasil. Waldir Troncoso Peres.</w:t>
+        <w:t>Para defender Augusto no júri, entrou em cena um dos criminalistas mais famosos do Brasil. Waldir Troncoso Peres.</w:t>
       </w:r>
     </w:p>
     <w:p>
@@ -135,7 +135,7 @@
         <w:rPr>
           <w:color w:val="000000"/>
         </w:rPr>
-        <w:t>Troncoso Peres era chamado de príncipe dos advogados. Ao longo da carreira, fez mais de mil júris. Era famoso pela oratória nos júris.</w:t>
+        <w:t>Troncoso Peres era chamado de príncipe dos advogados. Famoso pela oratória, fez mais de mil júris ao longo da carreira.</w:t>
       </w:r>
     </w:p>
     <w:p>
@@ -199,7 +199,7 @@
         <w:rPr>
           <w:color w:val="000000"/>
         </w:rPr>
-        <w:t>Entre elas estava a testemunha que ninguém esperava.</w:t>
+        <w:t>Entre elas estava a filha do casal.</w:t>
       </w:r>
     </w:p>
     <w:p>
@@ -231,7 +231,7 @@
         <w:rPr>
           <w:color w:val="000000"/>
         </w:rPr>
-        <w:t>Uma frase curta. Uma lembrança de criança. E exatamente o que a defesa precisava para sustentar a história de uma traição que ninguém conseguiu provar.</w:t>
+        <w:t>Uma lembrança de criança. E exatamente o que a defesa precisava para sustentar a história de uma traição que ninguém conseguiu provar.</w:t>
       </w:r>
     </w:p>
     <w:p>

</xml_diff>